<commit_message>
feat xog chặng 6
</commit_message>
<xml_diff>
--- a/docs/Luong_du_lieu_he_thong_bau_cu.docx
+++ b/docs/Luong_du_lieu_he_thong_bau_cu.docx
@@ -40,7 +40,7 @@
     <w:p>
       <w:pPr/>
       <w:r>
-        <w:t xml:space="preserve">Luồng dưới đây bám theo db/init.sql và ROADMAP.md trong dự án D:\HeThongBauCu. Đây là thiết kế dự kiến; các file Python hiện chưa triển khai xử lý. Những giá trị như HASH_PASSWORD, KEY_AES_1 bên dưới chỉ là ký hiệu minh họa.</w:t>
+        <w:t xml:space="preserve">Luồng dưới đây bám theo db/init.sql và ROADMAP.md trong dự án D:\HeThongBauCu. Các chặng 1–6 đã có code và kiểm tra riêng; giao diện vẫn theo thiết kế. Những giá trị như HASH_PASSWORD, KEY_AES_1 bên dưới chỉ là ký hiệu minh họa.</w:t>
       </w:r>
     </w:p>
     <w:p>
@@ -321,7 +321,7 @@
     <w:p>
       <w:pPr/>
       <w:r>
-        <w:t xml:space="preserve">Script app/database/seed_voters.py dự kiến tạo danh sách cử tri và mã kích hoạt. Với SV001, dòng trong voters ban đầu sẽ như sau:</w:t>
+        <w:t xml:space="preserve">Script app/database/seed_voters.py tạo danh sách cử tri và mã kích hoạt. Với SV001, dòng trong voters ban đầu sẽ như sau:</w:t>
       </w:r>
     </w:p>
     <w:tbl>
@@ -699,7 +699,7 @@
     <w:p>
       <w:pPr/>
       <w:r>
-        <w:t xml:space="preserve">Cũng ở giai đoạn khởi động backend, KMS dự kiến sinh cặp khóa RSA nếu chưa có, lưu ở thư mục KMS_KEY_DIR (dự kiến ./kms_keys trên máy local). Hiện Docker chỉ chạy PostgreSQL; khóa KMS không nằm trong 5 bảng này.</w:t>
+        <w:t xml:space="preserve">Cũng ở giai đoạn khởi động backend, KMS tạo cặp khóa RSA nếu chưa có, lưu ở thư mục KMS_KEY_DIR (mặc định ./kms_keys trên máy local). Hiện Docker chỉ chạy PostgreSQL; khóa KMS không nằm trong 5 bảng này.</w:t>
       </w:r>
     </w:p>
     <w:p>
@@ -1214,7 +1214,7 @@
               <w:pStyle w:val="TableText"/>
             </w:pPr>
             <w:r>
-              <w:t xml:space="preserve">Tùy thuật toán băm</w:t>
+              <w:t xml:space="preserve">Salt ngẫu nhiên riêng của SV001</w:t>
             </w:r>
           </w:p>
         </w:tc>
@@ -1287,7 +1287,7 @@
     <w:p>
       <w:pPr/>
       <w:r>
-        <w:t xml:space="preserve">Về salt: nếu dùng thuật toán lưu salt bên trong chuỗi hash như roadmap đề xuất thì cột riêng này có thể để NULL; phần này chưa được triển khai.</w:t>
+        <w:t xml:space="preserve">Về salt: backend dùng PBKDF2-HMAC-SHA256; cột salt lưu giá trị ngẫu nhiên riêng, còn password_hash lưu phiên bản, số vòng lặp và digest.</w:t>
       </w:r>
     </w:p>
     <w:p>
@@ -1863,7 +1863,7 @@
     <w:p>
       <w:pPr/>
       <w:r>
-        <w:t xml:space="preserve">Tên trường và thời hạn cụ thể chưa được code chốt.</w:t>
+        <w:t xml:space="preserve">JWT hiện chứa `sub`, `role`, `iat`, `exp`; thời hạn được lấy từ cấu hình backend.</w:t>
       </w:r>
     </w:p>
     <w:p>
@@ -2384,7 +2384,7 @@
     <w:p>
       <w:pPr/>
       <w:r>
-        <w:t xml:space="preserve">Theo roadmap, server có thể dựng lại cast từ mã cuộc bầu cử đang xử lý, danh tính trong JWT và nonce, ts của ballot để kiểm tra chữ ký. Hai phía phải thống nhất chính xác nội dung ký.</w:t>
+        <w:t xml:space="preserve">Server dựng lại cast từ mã cuộc bầu cử đang xử lý, danh tính trong JWT và nonce, ts của ballot để kiểm tra chữ ký. Hai phía phải thống nhất chính xác nội dung ký.</w:t>
       </w:r>
     </w:p>
     <w:p>
@@ -3821,7 +3821,7 @@
     <w:p>
       <w:pPr/>
       <w:r>
-        <w:t xml:space="preserve">Ví dụ bầu lúc 10:37 thì voted_at dự kiến lưu mốc 10:00 của giờ tương ứng.</w:t>
+        <w:t xml:space="preserve">Ví dụ bầu lúc 10:37 thì voted_at lưu mốc 10:00 của giờ tương ứng.</w:t>
       </w:r>
     </w:p>
     <w:p>
@@ -4268,7 +4268,7 @@
     <w:p>
       <w:pPr/>
       <w:r>
-        <w:t xml:space="preserve">Admin gửi username/password đến /admin/login. Backend dự kiến kiểm tra với cấu hình ADMIN_USERNAME, ADMIN_PASSWORD, rồi cấp JWT có quyền admin.</w:t>
+        <w:t xml:space="preserve">Admin gửi username/password đến /admin/login. Backend kiểm tra với cấu hình ADMIN_USERNAME, ADMIN_PASSWORD, rồi cấp JWT có quyền admin.</w:t>
       </w:r>
     </w:p>
     <w:p>
@@ -4564,7 +4564,7 @@
     <w:p>
       <w:pPr/>
       <w:r>
-        <w:t xml:space="preserve">Nếu giải mã hoặc kiểm tra tag thất bại thì không được cộng phiếu đó như phiếu hợp lệ; cách báo lỗi cụ thể hiện chưa được triển khai.</w:t>
+        <w:t xml:space="preserve">Nếu giải mã, kiểm tra tag, JSON hoặc mã ứng viên thất bại, backend dừng kiểm phiếu và trả lỗi chung thay vì tổng thiếu.</w:t>
       </w:r>
     </w:p>
     <w:p>

</xml_diff>